<commit_message>
Correct evaluation-history statement, fix Chapter 6 wording, add WM->retrieval arrow
Co-Authored-By: Claude Sonnet 5.5 <noreply@anthropic.com>
Claude-Session: https://claude.ai/code/session_012km1MXGk3VPHJprGNCE5s1
</commit_message>
<xml_diff>
--- a/report/Memory_Inspired_Chatbot_Report.docx
+++ b/report/Memory_Inspired_Chatbot_Report.docx
@@ -3872,7 +3872,7 @@
         <w:rPr>
           <w:b/>
         </w:rPr>
-        <w:t>Dev/test separation.</w:t>
+        <w:t>Dev/test separation and an honest account of the process.</w:t>
       </w:r>
       <w:r>
         <w:rPr>
@@ -3902,19 +3902,67 @@
         <w:rPr>
           <w:b w:val="0"/>
         </w:rPr>
-        <w:t xml:space="preserve"> templates were written </w:t>
+        <w:t xml:space="preserve"> templates use different phrasings, include forms the extractor does not cover, and were never used for tuning (100 personas, seeds 2000-2099, 1200 questions). The order of events matters and is as follows. (1) The extractor and memory code were first committed in c95a2ee. (2) The test templates were then written. (3) </w:t>
       </w:r>
       <w:r>
         <w:rPr>
           <w:i/>
         </w:rPr>
-        <w:t>after the extractor and memory code were committed</w:t>
+        <w:t>Before the first test-set run</w:t>
       </w:r>
       <w:r>
         <w:rPr>
           <w:b w:val="0"/>
         </w:rPr>
-        <w:t xml:space="preserve"> (commit c95a2ee), use different phrasings and include forms the extractor does not cover, and were never used for tuning (100 personas, seeds 2000-2099, 1200 questions). Small post-freeze changes were limited to bug fixes found on development data or in the demo, and we re-ran all experiments to confirm that held-out accuracies were unchanged (Chapter 6). Gold labels exist for every fact statement, so extractor precision and recall are measured directly.</w:t>
+        <w:t xml:space="preserve"> we changed the code again: several extractor patterns were generalised to fix errors seen on </w:t>
+      </w:r>
+      <w:r>
+        <w:rPr>
+          <w:i/>
+        </w:rPr>
+        <w:t>development</w:t>
+      </w:r>
+      <w:r>
+        <w:rPr>
+          <w:b w:val="0"/>
+        </w:rPr>
+        <w:t xml:space="preserve"> data (third-person frames such as "my neighbor works as a ...", "is now", a trailing "these days"), and a salience bug was fixed (the pronoun "I" was counted as a named entity). (4) After the first test run, the only change was refusal/keyword handling for third-party </w:t>
+      </w:r>
+      <w:r>
+        <w:rPr>
+          <w:i/>
+        </w:rPr>
+        <w:t>questions</w:t>
+      </w:r>
+      <w:r>
+        <w:rPr>
+          <w:b w:val="0"/>
+        </w:rPr>
+        <w:t xml:space="preserve"> (motivated by the demo), and we re-ran everything to confirm that all held-out accuracies were identical. The extractor was therefore </w:t>
+      </w:r>
+      <w:r>
+        <w:rPr>
+          <w:i/>
+        </w:rPr>
+        <w:t>not</w:t>
+      </w:r>
+      <w:r>
+        <w:rPr>
+          <w:b w:val="0"/>
+        </w:rPr>
+        <w:t xml:space="preserve"> frozen at c95a2ee. Its test-set precision/recall was 0.94/0.63 (F1 0.75) at c95a2ee and is 0.96/0.73 (F1 0.83) in the final version (development: 0.99/0.91 and 1.00/1.00). Moreover, the same team (with AI assistance) wrote both the test templates and the patterns, so the test split is held out from </w:t>
+      </w:r>
+      <w:r>
+        <w:rPr>
+          <w:i/>
+        </w:rPr>
+        <w:t>tuning</w:t>
+      </w:r>
+      <w:r>
+        <w:rPr>
+          <w:b w:val="0"/>
+        </w:rPr>
+        <w:t>, not from the authors' knowledge of the extractor. This is why the LoCoMo run, whose data we did not write, and the oracle-perception analysis matter. Gold labels exist for every fact statement, so extractor precision and recall are measured directly.</w:t>
       </w:r>
     </w:p>
     <w:p>
@@ -8047,7 +8095,7 @@
         <w:rPr>
           <w:b w:val="0"/>
         </w:rPr>
-        <w:t>Three observations temper this result. (1) The unbounded references are informative: a full-context reader scores 0.754, higher than the memory-inspired model, because it keeps every episodic detail (episodic accuracy 1.00 vs. 0.67). Selective memory trades detail for compactness: it holds about 37 items instead of 120. (2) Fact accuracy of 0.60 is capped by perception on unseen phrasings (Section 6.4). (3) Plain RAG with unlimited storage reaches only 0.569 on update questions (0.26), because its top-3 retrieval often returns the old statement or noise instead of the newest value. Structured updating is what the semantic store provides.</w:t>
+        <w:t>Three observations temper this result. (1) The unbounded references are informative: a full-context reader scores 0.754, higher than the memory-inspired model, because it keeps every episodic detail (episodic accuracy 1.00 vs. 0.67). Selective memory trades detail for compactness: it holds about 37 items instead of 120. (2) Fact accuracy of 0.60 is capped by perception on unseen phrasings (Section 6.4). (3) Plain RAG with unlimited storage reaches only 0.26 on update questions (overall 0.569), because its top-3 retrieval often returns the old statement or noise instead of the newest value. Structured updating is what the semantic store provides.</w:t>
       </w:r>
     </w:p>
     <w:p>
@@ -8808,7 +8856,7 @@
         <w:rPr>
           <w:b w:val="0"/>
         </w:rPr>
-        <w:t xml:space="preserve">The memory-inspired model leads at every budget up to 40 items, by 0.19 to 0.24 absolute at budgets 12-40. Its curve then flattens at 0.676-0.676 because it has already retained everything it will encode (the gate discards low-salience episodic detail and perception misses some facts), whereas the window and RAG keep improving as budget grows. At a budget of 120, where the whole conversation fits, the sliding window is better (0.754 vs. 0.676). The honest conclusion is therefore narrow: </w:t>
+        <w:t xml:space="preserve">The memory-inspired model leads at every budget up to 40 items, by 0.19 to 0.24 absolute at budgets 12-40. Its curve then plateaus at 0.676 because it has already retained everything it will encode (the gate discards low-salience episodic detail and perception misses some facts), whereas the window and RAG keep improving as budget grows. At a budget of 120, where the whole conversation fits, the sliding window is better (0.754 vs. 0.676). The honest conclusion is therefore narrow: </w:t>
       </w:r>
       <w:r>
         <w:rPr>
@@ -9574,7 +9622,7 @@
         <w:rPr>
           <w:b w:val="0"/>
         </w:rPr>
-        <w:t xml:space="preserve"> is the single most important component at both budgets (Δ -0.060 and -0.098). Compact (slot = value) traces survive eviction and answer directly. Without them the model only has noisy episodic retrieval, though it then does better on episodic detail (0.68).</w:t>
+        <w:t xml:space="preserve"> is the single most important component at both budgets (Δ -0.060 and -0.098). Compact (slot = value) traces survive eviction and answer directly. Without them the model only has noisy episodic retrieval, though at B=20 it then does better on episodic detail (0.35 vs. 0.12).</w:t>
       </w:r>
     </w:p>
     <w:p>
@@ -9652,13 +9700,25 @@
         <w:rPr>
           <w:b/>
         </w:rPr>
-        <w:t>no measurable benefit</w:t>
+        <w:t>no benefit</w:t>
       </w:r>
       <w:r>
         <w:rPr>
           <w:b w:val="0"/>
         </w:rPr>
-        <w:t>: removing it changes accuracy by +0.010 (B=20) and -0.001 (B=40). Its seven slots also count against the budget. The buffer exists for dialogue coherence and rehearsal counting, neither of which this end-of-conversation recall task rewards. We keep it because it is part of the theory-faithful design and report this as a negative result.</w:t>
+        <w:t xml:space="preserve"> and slightly </w:t>
+      </w:r>
+      <w:r>
+        <w:rPr>
+          <w:i/>
+        </w:rPr>
+        <w:t>hurt</w:t>
+      </w:r>
+      <w:r>
+        <w:rPr>
+          <w:b w:val="0"/>
+        </w:rPr>
+        <w:t xml:space="preserve"> at B=20: removing it changes accuracy by +0.010 (95% CI +0.001 to +0.019) at B=20 and -0.001 at B=40 (CI includes zero). Its seven slots count against the budget. The buffer exists for dialogue coherence and rehearsal counting, neither of which this end-of-conversation recall task rewards. We keep it because it is part of the theory-faithful design and report this as a negative result.</w:t>
       </w:r>
     </w:p>
     <w:p>
@@ -10554,7 +10614,7 @@
         <w:rPr>
           <w:b w:val="0"/>
         </w:rPr>
-        <w:t xml:space="preserve"> are not memory errors but a parser limitation: held-out phrasings such as "What is my main hobby?" are not recognised as slot questions, so the system falls back to returning the closest utterance ("The old hobby store on Main Street is gone", 11 cases; a friend's favourite music genre, 11; a friend's favourite food, 8; one unrelated utterance, 3). The system should abstain when no slot is recognised and the best match is weak. A relevance threshold on this fallback is a straightforward improvement we did not tune on test data.</w:t>
+        <w:t xml:space="preserve"> are not memory errors but largely a parser limitation: held-out phrasings such as "What is my main hobby?" or "Which music genre do I like?" are not recognised as slot questions, so the system falls back to returning the closest utterance. For the memory model the 33 cases were hobby 11, music 11, food 8 and city 3 questions, all via this episodic fallback. Examples we inspected: "The old hobby store on Main Street is gone" (hobby), a friend's favourite music genre (music) and "I have a canary at home" (city). The system should abstain when no slot is recognised and the best match is weak. A relevance threshold on this fallback is a straightforward improvement we did not tune on test data.</w:t>
       </w:r>
     </w:p>
     <w:p>

</xml_diff>

<commit_message>
Auto-download LoCoMo, add requirements.txt, rebuild report/slides from final results
Co-Authored-By: Claude Sonnet 5.5 <noreply@anthropic.com>
Claude-Session: https://claude.ai/code/session_012km1MXGk3VPHJprGNCE5s1
</commit_message>
<xml_diff>
--- a/report/Memory_Inspired_Chatbot_Report.docx
+++ b/report/Memory_Inspired_Chatbot_Report.docx
@@ -5623,7 +5623,7 @@
           <w:rFonts w:ascii="Courier New" w:hAnsi="Courier New"/>
           <w:sz w:val="18"/>
         </w:rPr>
-        <w:t>bot&gt; Here is what I remember: job: nurse; pet: parrot; hobby: painting; name: Priya; city: Toronto; favorite food: ramen.</w:t>
+        <w:t>bot&gt; Here is what I remember: job: nurse; pet: parrot; hobby: painting; city: Toronto; name: Priya; favorite food: ramen.</w:t>
       </w:r>
     </w:p>
     <w:p>
@@ -5733,7 +5733,7 @@
           <w:rFonts w:ascii="Courier New" w:hAnsi="Courier New"/>
           <w:sz w:val="18"/>
         </w:rPr>
-        <w:t>pip install numpy matplotlib pytest python-docx python-pptx</w:t>
+        <w:t>pip install -r requirements.txt   # Python 3.10+</w:t>
       </w:r>
     </w:p>
     <w:p>
@@ -5759,7 +5759,7 @@
           <w:rFonts w:ascii="Courier New" w:hAnsi="Courier New"/>
           <w:sz w:val="18"/>
         </w:rPr>
-        <w:t>python experiments/run_all.py        # all experiments -&gt; results/results.json (about 2 minutes)</w:t>
+        <w:t>python experiments/run_all.py        # all experiments -&gt; results/results.json (about 1-2 minutes)</w:t>
       </w:r>
     </w:p>
     <w:p>
@@ -6941,7 +6941,7 @@
                 <w:b w:val="0"/>
                 <w:sz w:val="18"/>
               </w:rPr>
-              <w:t>0.75</w:t>
+              <w:t>0.69</w:t>
             </w:r>
           </w:p>
         </w:tc>
@@ -7069,7 +7069,7 @@
                 <w:b w:val="0"/>
                 <w:sz w:val="18"/>
               </w:rPr>
-              <w:t>0.07</w:t>
+              <w:t>0.06</w:t>
             </w:r>
           </w:p>
         </w:tc>
@@ -10858,7 +10858,7 @@
         <w:rPr>
           <w:b w:val="0"/>
         </w:rPr>
-        <w:t>Plain RAG's footprint equals the conversation length and its per-question time grows with it (0.09 ms at 120 turns to 0.50 ms at 1,200 turns), while the budgeted memory model stays at 40 items with flat latency (0.06 ms). Its unbounded variant grows more slowly than the conversation (96 items for 1,200 turns). The cost is on the ingestion side: processing a whole conversation took 0.30 s versus 0.08 s for RAG because every turn triggers extraction, activation computation and an eviction scan. These timings use a small pure-Python implementation on one machine and a lexical index; accuracy at the longer lengths is based on only six personas and should not be over-interpreted.</w:t>
+        <w:t>Plain RAG's footprint equals the conversation length and its per-question time grows with it (0.09 ms at 120 turns to 0.48 ms at 1,200 turns), while the budgeted memory model stays at 40 items with flat latency (0.06 ms). Its unbounded variant grows more slowly than the conversation (96 items for 1,200 turns). The cost is on the ingestion side: processing a whole conversation took 0.32 s versus 0.08 s for RAG because every turn triggers extraction, activation computation and an eviction scan. These timings use a small pure-Python implementation on one machine and a lexical index; accuracy at the longer lengths is based on only six personas and should not be over-interpreted.</w:t>
       </w:r>
     </w:p>
     <w:p>

</xml_diff>

<commit_message>
Add Team 11 details; full README generated from results; rebuild report and slides
Co-Authored-By: Claude Sonnet 5.5 <noreply@anthropic.com>
Claude-Session: https://claude.ai/code/session_012km1MXGk3VPHJprGNCE5s1
</commit_message>
<xml_diff>
--- a/report/Memory_Inspired_Chatbot_Report.docx
+++ b/report/Memory_Inspired_Chatbot_Report.docx
@@ -98,6 +98,18 @@
     </w:p>
     <w:p>
       <w:pPr>
+        <w:spacing w:after="40"/>
+        <w:jc w:val="center"/>
+      </w:pPr>
+      <w:r>
+        <w:rPr>
+          <w:b/>
+        </w:rPr>
+        <w:t>Team 11</w:t>
+      </w:r>
+    </w:p>
+    <w:p>
+      <w:pPr>
         <w:spacing w:after="0"/>
         <w:jc w:val="center"/>
       </w:pPr>
@@ -105,7 +117,7 @@
         <w:rPr>
           <w:b w:val="0"/>
         </w:rPr>
-        <w:t>[Team member 1: name, roll number]</w:t>
+        <w:t>Yuvaraj S  (251AI050)</w:t>
       </w:r>
     </w:p>
     <w:p>
@@ -117,20 +129,49 @@
         <w:rPr>
           <w:b w:val="0"/>
         </w:rPr>
-        <w:t>[Team member 2: name, roll number]</w:t>
+        <w:t>Abhinav Karthik Rao  (251AI003)</w:t>
       </w:r>
     </w:p>
     <w:p>
       <w:pPr>
-        <w:spacing w:after="600"/>
+        <w:spacing w:after="0"/>
         <w:jc w:val="center"/>
       </w:pPr>
       <w:r>
         <w:rPr>
           <w:b w:val="0"/>
         </w:rPr>
-        <w:t>[Team member 3: name, roll number]</w:t>
-      </w:r>
+        <w:t>Mohammed Rayan  (251AI025)</w:t>
+      </w:r>
+    </w:p>
+    <w:p>
+      <w:pPr>
+        <w:spacing w:after="0"/>
+        <w:jc w:val="center"/>
+      </w:pPr>
+      <w:r>
+        <w:rPr>
+          <w:b w:val="0"/>
+        </w:rPr>
+        <w:t>Mohammed Ayyoub  (251AI026)</w:t>
+      </w:r>
+    </w:p>
+    <w:p>
+      <w:pPr>
+        <w:spacing w:after="0"/>
+        <w:jc w:val="center"/>
+      </w:pPr>
+      <w:r>
+        <w:rPr>
+          <w:b w:val="0"/>
+        </w:rPr>
+        <w:t>Jayant Nenmeli  (251AI022)</w:t>
+      </w:r>
+    </w:p>
+    <w:p>
+      <w:pPr>
+        <w:spacing w:after="400"/>
+      </w:pPr>
     </w:p>
     <w:p>
       <w:pPr>
@@ -14015,7 +14056,7 @@
         <w:rPr>
           <w:i/>
         </w:rPr>
-        <w:t>(To be completed by the team before submission.)</w:t>
+        <w:t>(Each member should describe their own contribution before submission.)</w:t>
       </w:r>
     </w:p>
     <w:p>
@@ -14035,7 +14076,7 @@
           <w:b w:val="0"/>
           <w:sz w:val="21"/>
         </w:rPr>
-        <w:t xml:space="preserve"> Individual contributions.</w:t>
+        <w:t xml:space="preserve"> Individual contributions (Team 11).</w:t>
       </w:r>
     </w:p>
     <w:tbl>
@@ -14053,7 +14094,7 @@
       <w:tr>
         <w:tc>
           <w:tcPr>
-            <w:tcW w:type="dxa" w:w="2304"/>
+            <w:tcW w:type="dxa" w:w="3456"/>
             <w:shd w:val="clear" w:fill="D9E2F3"/>
           </w:tcPr>
           <w:p>
@@ -14069,7 +14110,7 @@
         </w:tc>
         <w:tc>
           <w:tcPr>
-            <w:tcW w:type="dxa" w:w="7056"/>
+            <w:tcW w:type="dxa" w:w="5904"/>
             <w:shd w:val="clear" w:fill="D9E2F3"/>
           </w:tcPr>
           <w:p>
@@ -14087,7 +14128,7 @@
       <w:tr>
         <w:tc>
           <w:tcPr>
-            <w:tcW w:type="dxa" w:w="2304"/>
+            <w:tcW w:type="dxa" w:w="3456"/>
           </w:tcPr>
           <w:p>
             <w:pPr>
@@ -14099,13 +14140,13 @@
                 <w:b w:val="0"/>
                 <w:sz w:val="19"/>
               </w:rPr>
-              <w:t>[Name 1]</w:t>
-            </w:r>
-          </w:p>
-        </w:tc>
-        <w:tc>
-          <w:tcPr>
-            <w:tcW w:type="dxa" w:w="7056"/>
+              <w:t>Yuvaraj S (251AI050)</w:t>
+            </w:r>
+          </w:p>
+        </w:tc>
+        <w:tc>
+          <w:tcPr>
+            <w:tcW w:type="dxa" w:w="5904"/>
           </w:tcPr>
           <w:p>
             <w:pPr>
@@ -14117,7 +14158,7 @@
                 <w:b w:val="0"/>
                 <w:sz w:val="19"/>
               </w:rPr>
-              <w:t>[e.g., system design, memory module implementation, experiments]</w:t>
+              <w:t>[to be filled by the team]</w:t>
             </w:r>
           </w:p>
         </w:tc>
@@ -14125,7 +14166,7 @@
       <w:tr>
         <w:tc>
           <w:tcPr>
-            <w:tcW w:type="dxa" w:w="2304"/>
+            <w:tcW w:type="dxa" w:w="3456"/>
           </w:tcPr>
           <w:p>
             <w:pPr>
@@ -14137,13 +14178,13 @@
                 <w:b w:val="0"/>
                 <w:sz w:val="19"/>
               </w:rPr>
-              <w:t>[Name 2]</w:t>
-            </w:r>
-          </w:p>
-        </w:tc>
-        <w:tc>
-          <w:tcPr>
-            <w:tcW w:type="dxa" w:w="7056"/>
+              <w:t>Abhinav Karthik Rao (251AI003)</w:t>
+            </w:r>
+          </w:p>
+        </w:tc>
+        <w:tc>
+          <w:tcPr>
+            <w:tcW w:type="dxa" w:w="5904"/>
           </w:tcPr>
           <w:p>
             <w:pPr>
@@ -14155,7 +14196,7 @@
                 <w:b w:val="0"/>
                 <w:sz w:val="19"/>
               </w:rPr>
-              <w:t>[e.g., literature review, benchmark design, report writing]</w:t>
+              <w:t>[to be filled by the team]</w:t>
             </w:r>
           </w:p>
         </w:tc>
@@ -14163,7 +14204,7 @@
       <w:tr>
         <w:tc>
           <w:tcPr>
-            <w:tcW w:type="dxa" w:w="2304"/>
+            <w:tcW w:type="dxa" w:w="3456"/>
           </w:tcPr>
           <w:p>
             <w:pPr>
@@ -14175,13 +14216,13 @@
                 <w:b w:val="0"/>
                 <w:sz w:val="19"/>
               </w:rPr>
-              <w:t>[Name 3]</w:t>
-            </w:r>
-          </w:p>
-        </w:tc>
-        <w:tc>
-          <w:tcPr>
-            <w:tcW w:type="dxa" w:w="7056"/>
+              <w:t>Mohammed Rayan (251AI025)</w:t>
+            </w:r>
+          </w:p>
+        </w:tc>
+        <w:tc>
+          <w:tcPr>
+            <w:tcW w:type="dxa" w:w="5904"/>
           </w:tcPr>
           <w:p>
             <w:pPr>
@@ -14193,7 +14234,83 @@
                 <w:b w:val="0"/>
                 <w:sz w:val="19"/>
               </w:rPr>
-              <w:t>[e.g., evaluation, figures, presentation, demo]</w:t>
+              <w:t>[to be filled by the team]</w:t>
+            </w:r>
+          </w:p>
+        </w:tc>
+      </w:tr>
+      <w:tr>
+        <w:tc>
+          <w:tcPr>
+            <w:tcW w:type="dxa" w:w="3456"/>
+          </w:tcPr>
+          <w:p>
+            <w:pPr>
+              <w:spacing w:after="0"/>
+            </w:pPr>
+            <w:r/>
+            <w:r>
+              <w:rPr>
+                <w:b w:val="0"/>
+                <w:sz w:val="19"/>
+              </w:rPr>
+              <w:t>Mohammed Ayyoub (251AI026)</w:t>
+            </w:r>
+          </w:p>
+        </w:tc>
+        <w:tc>
+          <w:tcPr>
+            <w:tcW w:type="dxa" w:w="5904"/>
+          </w:tcPr>
+          <w:p>
+            <w:pPr>
+              <w:spacing w:after="0"/>
+            </w:pPr>
+            <w:r/>
+            <w:r>
+              <w:rPr>
+                <w:b w:val="0"/>
+                <w:sz w:val="19"/>
+              </w:rPr>
+              <w:t>[to be filled by the team]</w:t>
+            </w:r>
+          </w:p>
+        </w:tc>
+      </w:tr>
+      <w:tr>
+        <w:tc>
+          <w:tcPr>
+            <w:tcW w:type="dxa" w:w="3456"/>
+          </w:tcPr>
+          <w:p>
+            <w:pPr>
+              <w:spacing w:after="0"/>
+            </w:pPr>
+            <w:r/>
+            <w:r>
+              <w:rPr>
+                <w:b w:val="0"/>
+                <w:sz w:val="19"/>
+              </w:rPr>
+              <w:t>Jayant Nenmeli (251AI022)</w:t>
+            </w:r>
+          </w:p>
+        </w:tc>
+        <w:tc>
+          <w:tcPr>
+            <w:tcW w:type="dxa" w:w="5904"/>
+          </w:tcPr>
+          <w:p>
+            <w:pPr>
+              <w:spacing w:after="0"/>
+            </w:pPr>
+            <w:r/>
+            <w:r>
+              <w:rPr>
+                <w:b w:val="0"/>
+                <w:sz w:val="19"/>
+              </w:rPr>
+              <w:t>[to be filled by the team]</w:t>
             </w:r>
           </w:p>
         </w:tc>

</xml_diff>